<commit_message>
adding some utilities related to geocoding and mapping
</commit_message>
<xml_diff>
--- a/Tabular_data/invoice_data.docx
+++ b/Tabular_data/invoice_data.docx
@@ -551,6 +551,178 @@
           </w:p>
         </w:tc>
       </w:tr>
+      <w:tr>
+        <w:tc>
+          <w:tcPr>
+            <w:tcW w:type="dxa" w:w="508"/>
+          </w:tcPr>
+          <w:p>
+            <w:r>
+              <w:t>order3.pdf</w:t>
+            </w:r>
+          </w:p>
+        </w:tc>
+        <w:tc>
+          <w:tcPr>
+            <w:tcW w:type="dxa" w:w="508"/>
+          </w:tcPr>
+          <w:p>
+            <w:r>
+              <w:t>Arati deep</w:t>
+            </w:r>
+          </w:p>
+        </w:tc>
+        <w:tc>
+          <w:tcPr>
+            <w:tcW w:type="dxa" w:w="508"/>
+          </w:tcPr>
+          <w:p>
+            <w:r>
+              <w:t>suna nibasa horizon pada risida suna nibasa horizon pada risida suna nibas horizon pada risida kalahandi, Odisha, 766031</w:t>
+            </w:r>
+          </w:p>
+        </w:tc>
+        <w:tc>
+          <w:tcPr>
+            <w:tcW w:type="dxa" w:w="508"/>
+          </w:tcPr>
+          <w:p>
+            <w:r>
+              <w:t>766031</w:t>
+            </w:r>
+          </w:p>
+        </w:tc>
+        <w:tc>
+          <w:tcPr>
+            <w:tcW w:type="dxa" w:w="508"/>
+          </w:tcPr>
+          <w:p>
+            <w:r>
+              <w:t>323681040457654144</w:t>
+            </w:r>
+          </w:p>
+        </w:tc>
+        <w:tc>
+          <w:tcPr>
+            <w:tcW w:type="dxa" w:w="508"/>
+          </w:tcPr>
+          <w:p>
+            <w:r>
+              <w:t>cr1jz27383</w:t>
+            </w:r>
+          </w:p>
+        </w:tc>
+        <w:tc>
+          <w:tcPr>
+            <w:tcW w:type="dxa" w:w="508"/>
+          </w:tcPr>
+          <w:p>
+            <w:r>
+              <w:t>25.08.2026</w:t>
+            </w:r>
+          </w:p>
+        </w:tc>
+        <w:tc>
+          <w:tcPr>
+            <w:tcW w:type="dxa" w:w="508"/>
+          </w:tcPr>
+          <w:p>
+            <w:r>
+              <w:t>25.08.2026</w:t>
+            </w:r>
+          </w:p>
+        </w:tc>
+        <w:tc>
+          <w:tcPr>
+            <w:tcW w:type="dxa" w:w="508"/>
+          </w:tcPr>
+          <w:p>
+            <w:r>
+              <w:t>Nvblublu</w:t>
+            </w:r>
+          </w:p>
+        </w:tc>
+        <w:tc>
+          <w:tcPr>
+            <w:tcW w:type="dxa" w:w="508"/>
+          </w:tcPr>
+          <w:p>
+            <w:r>
+              <w:t>Semi Stitched</w:t>
+            </w:r>
+          </w:p>
+        </w:tc>
+        <w:tc>
+          <w:tcPr>
+            <w:tcW w:type="dxa" w:w="508"/>
+          </w:tcPr>
+          <w:p>
+            <w:r>
+              <w:t>1</w:t>
+            </w:r>
+          </w:p>
+        </w:tc>
+        <w:tc>
+          <w:tcPr>
+            <w:tcW w:type="dxa" w:w="508"/>
+          </w:tcPr>
+          <w:p>
+            <w:r>
+              <w:t>NA</w:t>
+            </w:r>
+          </w:p>
+        </w:tc>
+        <w:tc>
+          <w:tcPr>
+            <w:tcW w:type="dxa" w:w="508"/>
+          </w:tcPr>
+          <w:p>
+            <w:r>
+              <w:t>323681040457654144_1</w:t>
+            </w:r>
+          </w:p>
+        </w:tc>
+        <w:tc>
+          <w:tcPr>
+            <w:tcW w:type="dxa" w:w="508"/>
+          </w:tcPr>
+          <w:p>
+            <w:r>
+              <w:t>Sambalpuri handloom cotton dress material - Semi Stitched</w:t>
+            </w:r>
+          </w:p>
+        </w:tc>
+        <w:tc>
+          <w:tcPr>
+            <w:tcW w:type="dxa" w:w="508"/>
+          </w:tcPr>
+          <w:p>
+            <w:r>
+              <w:t>1888.0</w:t>
+            </w:r>
+          </w:p>
+        </w:tc>
+        <w:tc>
+          <w:tcPr>
+            <w:tcW w:type="dxa" w:w="508"/>
+          </w:tcPr>
+          <w:p>
+            <w:r>
+              <w:t>21.0</w:t>
+            </w:r>
+          </w:p>
+        </w:tc>
+        <w:tc>
+          <w:tcPr>
+            <w:tcW w:type="dxa" w:w="508"/>
+          </w:tcPr>
+          <w:p>
+            <w:r>
+              <w:t>1867.0</w:t>
+            </w:r>
+          </w:p>
+        </w:tc>
+      </w:tr>
     </w:tbl>
     <w:sectPr>
       <w:pgSz w:w="12240" w:h="15840"/>

</xml_diff>

<commit_message>
made it more modular.
</commit_message>
<xml_diff>
--- a/Tabular_data/invoice_data.docx
+++ b/Tabular_data/invoice_data.docx
@@ -43,6 +43,26 @@
           <w:p>
             <w:r>
               <w:t>source_file</w:t>
+            </w:r>
+          </w:p>
+        </w:tc>
+        <w:tc>
+          <w:tcPr>
+            <w:tcW w:type="dxa" w:w="508"/>
+          </w:tcPr>
+          <w:p>
+            <w:r>
+              <w:t>order_id</w:t>
+            </w:r>
+          </w:p>
+        </w:tc>
+        <w:tc>
+          <w:tcPr>
+            <w:tcW w:type="dxa" w:w="508"/>
+          </w:tcPr>
+          <w:p>
+            <w:r>
+              <w:t>Product</w:t>
             </w:r>
           </w:p>
         </w:tc>
@@ -122,16 +142,6 @@
           </w:tcPr>
           <w:p>
             <w:r>
-              <w:t>sku</w:t>
-            </w:r>
-          </w:p>
-        </w:tc>
-        <w:tc>
-          <w:tcPr>
-            <w:tcW w:type="dxa" w:w="508"/>
-          </w:tcPr>
-          <w:p>
-            <w:r>
               <w:t>size</w:t>
             </w:r>
           </w:p>
@@ -153,16 +163,6 @@
           <w:p>
             <w:r>
               <w:t>color</w:t>
-            </w:r>
-          </w:p>
-        </w:tc>
-        <w:tc>
-          <w:tcPr>
-            <w:tcW w:type="dxa" w:w="508"/>
-          </w:tcPr>
-          <w:p>
-            <w:r>
-              <w:t>order_id</w:t>
             </w:r>
           </w:p>
         </w:tc>
@@ -215,6 +215,26 @@
           <w:p>
             <w:r>
               <w:t>order1.pdf</w:t>
+            </w:r>
+          </w:p>
+        </w:tc>
+        <w:tc>
+          <w:tcPr>
+            <w:tcW w:type="dxa" w:w="508"/>
+          </w:tcPr>
+          <w:p>
+            <w:r>
+              <w:t>323539655056164032_1</w:t>
+            </w:r>
+          </w:p>
+        </w:tc>
+        <w:tc>
+          <w:tcPr>
+            <w:tcW w:type="dxa" w:w="508"/>
+          </w:tcPr>
+          <w:p>
+            <w:r>
+              <w:t>Greenred 0</w:t>
             </w:r>
           </w:p>
         </w:tc>
@@ -294,16 +314,6 @@
           </w:tcPr>
           <w:p>
             <w:r>
-              <w:t>Greenred 0</w:t>
-            </w:r>
-          </w:p>
-        </w:tc>
-        <w:tc>
-          <w:tcPr>
-            <w:tcW w:type="dxa" w:w="508"/>
-          </w:tcPr>
-          <w:p>
-            <w:r>
               <w:t>Un Stitched</w:t>
             </w:r>
           </w:p>
@@ -325,16 +335,6 @@
           <w:p>
             <w:r>
               <w:t>NA</w:t>
-            </w:r>
-          </w:p>
-        </w:tc>
-        <w:tc>
-          <w:tcPr>
-            <w:tcW w:type="dxa" w:w="508"/>
-          </w:tcPr>
-          <w:p>
-            <w:r>
-              <w:t>323539655056164032_1</w:t>
             </w:r>
           </w:p>
         </w:tc>
@@ -387,6 +387,26 @@
           <w:p>
             <w:r>
               <w:t>order2.pdf</w:t>
+            </w:r>
+          </w:p>
+        </w:tc>
+        <w:tc>
+          <w:tcPr>
+            <w:tcW w:type="dxa" w:w="508"/>
+          </w:tcPr>
+          <w:p>
+            <w:r>
+              <w:t>323435792117249984_1</w:t>
+            </w:r>
+          </w:p>
+        </w:tc>
+        <w:tc>
+          <w:tcPr>
+            <w:tcW w:type="dxa" w:w="508"/>
+          </w:tcPr>
+          <w:p>
+            <w:r>
+              <w:t>Nvblured</w:t>
             </w:r>
           </w:p>
         </w:tc>
@@ -466,16 +486,6 @@
           </w:tcPr>
           <w:p>
             <w:r>
-              <w:t>Nvblured</w:t>
-            </w:r>
-          </w:p>
-        </w:tc>
-        <w:tc>
-          <w:tcPr>
-            <w:tcW w:type="dxa" w:w="508"/>
-          </w:tcPr>
-          <w:p>
-            <w:r>
               <w:t>Semi Stitched</w:t>
             </w:r>
           </w:p>
@@ -497,16 +507,6 @@
           <w:p>
             <w:r>
               <w:t>NA</w:t>
-            </w:r>
-          </w:p>
-        </w:tc>
-        <w:tc>
-          <w:tcPr>
-            <w:tcW w:type="dxa" w:w="508"/>
-          </w:tcPr>
-          <w:p>
-            <w:r>
-              <w:t>323435792117249984_1</w:t>
             </w:r>
           </w:p>
         </w:tc>
@@ -559,6 +559,26 @@
           <w:p>
             <w:r>
               <w:t>order3.pdf</w:t>
+            </w:r>
+          </w:p>
+        </w:tc>
+        <w:tc>
+          <w:tcPr>
+            <w:tcW w:type="dxa" w:w="508"/>
+          </w:tcPr>
+          <w:p>
+            <w:r>
+              <w:t>323681040457654144_1</w:t>
+            </w:r>
+          </w:p>
+        </w:tc>
+        <w:tc>
+          <w:tcPr>
+            <w:tcW w:type="dxa" w:w="508"/>
+          </w:tcPr>
+          <w:p>
+            <w:r>
+              <w:t>Nvblublu</w:t>
             </w:r>
           </w:p>
         </w:tc>
@@ -638,16 +658,6 @@
           </w:tcPr>
           <w:p>
             <w:r>
-              <w:t>Nvblublu</w:t>
-            </w:r>
-          </w:p>
-        </w:tc>
-        <w:tc>
-          <w:tcPr>
-            <w:tcW w:type="dxa" w:w="508"/>
-          </w:tcPr>
-          <w:p>
-            <w:r>
               <w:t>Semi Stitched</w:t>
             </w:r>
           </w:p>
@@ -669,16 +679,6 @@
           <w:p>
             <w:r>
               <w:t>NA</w:t>
-            </w:r>
-          </w:p>
-        </w:tc>
-        <w:tc>
-          <w:tcPr>
-            <w:tcW w:type="dxa" w:w="508"/>
-          </w:tcPr>
-          <w:p>
-            <w:r>
-              <w:t>323681040457654144_1</w:t>
             </w:r>
           </w:p>
         </w:tc>

</xml_diff>